<commit_message>
Ergänze Instagram-Datenschutzhinweise in Datenschutzerklärung
</commit_message>
<xml_diff>
--- a/docs/Datenschutzerklaerung_LoopLeaf_Vercel_iOS_und_Android_27Mai26.docx
+++ b/docs/Datenschutzerklaerung_LoopLeaf_Vercel_iOS_und_Android_27Mai26.docx
@@ -2275,16 +2275,45 @@
         <w:pStyle w:val="Aufzhlungszeichen"/>
       </w:pPr>
       <w:r>
-        <w:t xml:space="preserve">bevorzugter Kontaktweg, zum Beispiel WhatsApp, Nachricht, Anruf, Sprachnachricht, </w:t>
+        <w:t xml:space="preserve">bevorzugter Kontaktweg, zum Beispiel WhatsApp, </w:t>
       </w:r>
       <w:proofErr w:type="spellStart"/>
       <w:r>
-        <w:t>Videocall</w:t>
+        <w:t>Nachricht</w:t>
       </w:r>
       <w:proofErr w:type="spellEnd"/>
       <w:r>
-        <w:t>, Treffen oder Sonstiges</w:t>
-      </w:r>
+        <w:t xml:space="preserve">, </w:t>
+      </w:r>
+      <w:proofErr w:type="spellStart"/>
+      <w:r>
+        <w:t>Anruf</w:t>
+      </w:r>
+      <w:proofErr w:type="spellEnd"/>
+      <w:r>
+        <w:t xml:space="preserve">, </w:t>
+      </w:r>
+      <w:proofErr w:type="spellStart"/>
+      <w:r>
+        <w:t>Sprachnachricht</w:t>
+      </w:r>
+      <w:proofErr w:type="spellEnd"/>
+      <w:r>
+        <w:t xml:space="preserve">, Videocall, Treffen </w:t>
+      </w:r>
+      <w:proofErr w:type="spellStart"/>
+      <w:r>
+        <w:t>oder</w:t>
+      </w:r>
+      <w:proofErr w:type="spellEnd"/>
+      <w:r>
+        <w:t xml:space="preserve"> </w:t>
+      </w:r>
+      <w:proofErr w:type="spellStart"/>
+      <w:r>
+        <w:t>Sonstiges</w:t>
+      </w:r>
+      <w:proofErr w:type="spellEnd"/>
     </w:p>
     <w:p>
       <w:pPr>
@@ -4542,20 +4571,7 @@
           <w:szCs w:val="21"/>
           <w:lang w:val="de-DE" w:eastAsia="de-DE"/>
         </w:rPr>
-        <w:t xml:space="preserve"> Hub können insbesondere die gesetzlich erforderlichen Anbieterangaben, Kontaktmöglichkeiten sowie Verlinkungen zu projektbezogenen Online-Auftritten, etwa zur Website oder zum Instagram-Profil, bereitgestellt werden. Bei einem Link zum Apple App Store oder Google Play Store kann insbesondere die jeweilige App-Store-Seite im Browser oder direkt in der jeweiligen Store-App geöffnet werden. Dabei können durch den jeweiligen Website-, Plattform-, App-Store- oder Dienstanbieter technisch notwendige Zugriffsdaten verarbeitet werden. Für die Verarbeitung auf den externen Seiten und in externen Anwendungen gelten die Datenschutzinformationen des jeweiligen </w:t>
-      </w:r>
-      <w:proofErr w:type="spellStart"/>
-      <w:r>
-        <w:rPr>
-          <w:rFonts w:asciiTheme="minorHAnsi" w:eastAsia="Times New Roman" w:hAnsiTheme="minorHAnsi" w:cs="Times New Roman"/>
-          <w:b w:val="0"/>
-          <w:bCs w:val="0"/>
-          <w:color w:val="26352F"/>
-          <w:sz w:val="21"/>
-          <w:szCs w:val="21"/>
-          <w:lang w:val="de-DE" w:eastAsia="de-DE"/>
-        </w:rPr>
-        <w:t>Anbieters.</w:t>
+        <w:t xml:space="preserve"> Hub können insbesondere die gesetzlich erforderlichen Anbieterangaben, Kontaktmöglichkeiten sowie Verlinkungen zu projektbezogenen Online-Auftritten, etwa zur Website oder zum Instagram-Profil, bereitgestellt werden. Bei einem Link zum Apple App Store oder Google Play Store kann insbesondere die jeweilige App-Store-Seite im Browser oder direkt in der jeweiligen Store-App geöffnet werden. Dabei können durch den jeweiligen Website-, Plattform-, App-Store- oder Dienstanbieter technisch notwendige Zugriffsdaten verarbeitet werden. Für die Verarbeitung auf den externen Seiten und in externen Anwendungen gelten die Datenschutzinformationen des jeweiligen Anbieters.</w:t>
       </w:r>
     </w:p>
     <w:p>
@@ -4570,14 +4586,7 @@
         <w:rPr>
           <w:lang w:val="de-DE"/>
         </w:rPr>
-        <w:t>Suppor</w:t>
-      </w:r>
-      <w:proofErr w:type="spellEnd"/>
-      <w:r>
-        <w:rPr>
-          <w:lang w:val="de-DE"/>
-        </w:rPr>
-        <w:t>t und Feedback per E-Mail</w:t>
+        <w:t>Support und Feedback per E-Mail</w:t>
       </w:r>
     </w:p>
     <w:p>
@@ -5010,10 +5019,13 @@
       <w:pPr>
         <w:pStyle w:val="StandardWeb"/>
         <w:rPr>
-          <w:rFonts w:asciiTheme="minorHAnsi" w:hAnsiTheme="minorHAnsi"/>
-          <w:color w:val="26352F"/>
-          <w:sz w:val="21"/>
-          <w:szCs w:val="21"/>
+          <w:rFonts w:asciiTheme="majorHAnsi" w:eastAsiaTheme="majorEastAsia" w:hAnsiTheme="majorHAnsi" w:cstheme="majorBidi"/>
+          <w:b/>
+          <w:bCs/>
+          <w:color w:val="4F81BD" w:themeColor="accent1"/>
+          <w:sz w:val="28"/>
+          <w:szCs w:val="26"/>
+          <w:lang w:eastAsia="en-US"/>
         </w:rPr>
       </w:pPr>
       <w:r>
@@ -5065,17 +5077,979 @@
         </w:rPr>
         <w:t xml:space="preserve"> zur Anzeige externer Inhalte innerhalb der App.</w:t>
       </w:r>
-    </w:p>
-    <w:p>
-      <w:pPr>
-        <w:tabs>
-          <w:tab w:val="left" w:pos="1678"/>
-        </w:tabs>
-        <w:rPr>
-          <w:rFonts w:asciiTheme="minorHAnsi" w:hAnsiTheme="minorHAnsi"/>
-          <w:lang w:val="de-DE"/>
-        </w:rPr>
-      </w:pPr>
+      <w:r>
+        <w:rPr>
+          <w:rFonts w:asciiTheme="minorHAnsi" w:hAnsiTheme="minorHAnsi"/>
+          <w:color w:val="26352F"/>
+          <w:sz w:val="21"/>
+          <w:szCs w:val="21"/>
+        </w:rPr>
+        <w:br/>
+      </w:r>
+      <w:r>
+        <w:rPr>
+          <w:rFonts w:asciiTheme="minorHAnsi" w:hAnsiTheme="minorHAnsi"/>
+          <w:color w:val="26352F"/>
+          <w:sz w:val="21"/>
+          <w:szCs w:val="21"/>
+        </w:rPr>
+        <w:br/>
+      </w:r>
+      <w:bookmarkStart w:id="4" w:name="OLE_LINK5"/>
+      <w:r>
+        <w:rPr>
+          <w:rFonts w:asciiTheme="majorHAnsi" w:eastAsiaTheme="majorEastAsia" w:hAnsiTheme="majorHAnsi" w:cstheme="majorBidi"/>
+          <w:b/>
+          <w:bCs/>
+          <w:color w:val="4F81BD" w:themeColor="accent1"/>
+          <w:sz w:val="28"/>
+          <w:szCs w:val="26"/>
+          <w:lang w:eastAsia="en-US"/>
+        </w:rPr>
+        <w:t>7. Datenschutzhinweise für unser Instagram-Profil @loopleaf.app</w:t>
+      </w:r>
+    </w:p>
+    <w:p>
+      <w:pPr>
+        <w:pStyle w:val="berschrift3"/>
+        <w:spacing w:after="120"/>
+        <w:rPr>
+          <w:lang w:val="de-DE"/>
+        </w:rPr>
+      </w:pPr>
+      <w:r>
+        <w:rPr>
+          <w:lang w:val="de-DE"/>
+        </w:rPr>
+        <w:lastRenderedPageBreak/>
+        <w:t>Verantwortlichkeit und Zweck des Instagram-Profils</w:t>
+      </w:r>
+    </w:p>
+    <w:p>
+      <w:pPr>
+        <w:pStyle w:val="StandardWeb"/>
+        <w:rPr>
+          <w:rFonts w:asciiTheme="minorHAnsi" w:hAnsiTheme="minorHAnsi"/>
+          <w:color w:val="26352F"/>
+          <w:sz w:val="21"/>
+          <w:szCs w:val="21"/>
+        </w:rPr>
+      </w:pPr>
+      <w:r>
+        <w:rPr>
+          <w:rFonts w:asciiTheme="minorHAnsi" w:hAnsiTheme="minorHAnsi"/>
+          <w:color w:val="26352F"/>
+          <w:sz w:val="21"/>
+          <w:szCs w:val="21"/>
+        </w:rPr>
+        <w:t>Ich betreibe als Verantwortliche das Instagram-Profil @loopleaf.app, um über die App „</w:t>
+      </w:r>
+      <w:proofErr w:type="spellStart"/>
+      <w:r>
+        <w:rPr>
+          <w:rFonts w:asciiTheme="minorHAnsi" w:hAnsiTheme="minorHAnsi"/>
+          <w:color w:val="26352F"/>
+          <w:sz w:val="21"/>
+          <w:szCs w:val="21"/>
+        </w:rPr>
+        <w:t>LoopLeaf</w:t>
+      </w:r>
+      <w:proofErr w:type="spellEnd"/>
+      <w:r>
+        <w:rPr>
+          <w:rFonts w:asciiTheme="minorHAnsi" w:hAnsiTheme="minorHAnsi"/>
+          <w:color w:val="26352F"/>
+          <w:sz w:val="21"/>
+          <w:szCs w:val="21"/>
+        </w:rPr>
+        <w:t xml:space="preserve">“, Neuigkeiten, Hintergründe und projektbezogene Inhalte zu informieren und mit interessierten </w:t>
+      </w:r>
+      <w:proofErr w:type="spellStart"/>
+      <w:proofErr w:type="gramStart"/>
+      <w:r>
+        <w:rPr>
+          <w:rFonts w:asciiTheme="minorHAnsi" w:hAnsiTheme="minorHAnsi"/>
+          <w:color w:val="26352F"/>
+          <w:sz w:val="21"/>
+          <w:szCs w:val="21"/>
+        </w:rPr>
+        <w:t>Nutzer:innen</w:t>
+      </w:r>
+      <w:proofErr w:type="spellEnd"/>
+      <w:proofErr w:type="gramEnd"/>
+      <w:r>
+        <w:rPr>
+          <w:rFonts w:asciiTheme="minorHAnsi" w:hAnsiTheme="minorHAnsi"/>
+          <w:color w:val="26352F"/>
+          <w:sz w:val="21"/>
+          <w:szCs w:val="21"/>
+        </w:rPr>
+        <w:t xml:space="preserve"> in Kontakt zu treten. Soweit in diesen Datenschutzhinweisen von „wir“, „uns“ oder „unserem Instagram-Profil“ die Rede ist, bezieht sich dies auf den Betrieb des Projekts </w:t>
+      </w:r>
+      <w:proofErr w:type="spellStart"/>
+      <w:r>
+        <w:rPr>
+          <w:rFonts w:asciiTheme="minorHAnsi" w:hAnsiTheme="minorHAnsi"/>
+          <w:color w:val="26352F"/>
+          <w:sz w:val="21"/>
+          <w:szCs w:val="21"/>
+        </w:rPr>
+        <w:t>LoopLeaf</w:t>
+      </w:r>
+      <w:proofErr w:type="spellEnd"/>
+      <w:r>
+        <w:rPr>
+          <w:rFonts w:asciiTheme="minorHAnsi" w:hAnsiTheme="minorHAnsi"/>
+          <w:color w:val="26352F"/>
+          <w:sz w:val="21"/>
+          <w:szCs w:val="21"/>
+        </w:rPr>
+        <w:t xml:space="preserve"> durch die im Impressum genannte verantwortliche Person.</w:t>
+      </w:r>
+    </w:p>
+    <w:p>
+      <w:pPr>
+        <w:pStyle w:val="StandardWeb"/>
+        <w:rPr>
+          <w:rFonts w:asciiTheme="minorHAnsi" w:hAnsiTheme="minorHAnsi"/>
+          <w:color w:val="26352F"/>
+          <w:sz w:val="21"/>
+          <w:szCs w:val="21"/>
+        </w:rPr>
+      </w:pPr>
+      <w:r>
+        <w:rPr>
+          <w:rFonts w:asciiTheme="minorHAnsi" w:hAnsiTheme="minorHAnsi"/>
+          <w:color w:val="26352F"/>
+          <w:sz w:val="21"/>
+          <w:szCs w:val="21"/>
+        </w:rPr>
+        <w:t xml:space="preserve">Instagram ist ein Dienst der </w:t>
+      </w:r>
+      <w:proofErr w:type="spellStart"/>
+      <w:r>
+        <w:rPr>
+          <w:rFonts w:asciiTheme="minorHAnsi" w:hAnsiTheme="minorHAnsi"/>
+          <w:color w:val="26352F"/>
+          <w:sz w:val="21"/>
+          <w:szCs w:val="21"/>
+        </w:rPr>
+        <w:t>Meta</w:t>
+      </w:r>
+      <w:proofErr w:type="spellEnd"/>
+      <w:r>
+        <w:rPr>
+          <w:rFonts w:asciiTheme="minorHAnsi" w:hAnsiTheme="minorHAnsi"/>
+          <w:color w:val="26352F"/>
+          <w:sz w:val="21"/>
+          <w:szCs w:val="21"/>
+        </w:rPr>
+        <w:t xml:space="preserve"> Platforms </w:t>
+      </w:r>
+      <w:proofErr w:type="spellStart"/>
+      <w:r>
+        <w:rPr>
+          <w:rFonts w:asciiTheme="minorHAnsi" w:hAnsiTheme="minorHAnsi"/>
+          <w:color w:val="26352F"/>
+          <w:sz w:val="21"/>
+          <w:szCs w:val="21"/>
+        </w:rPr>
+        <w:t>Ireland</w:t>
+      </w:r>
+      <w:proofErr w:type="spellEnd"/>
+      <w:r>
+        <w:rPr>
+          <w:rFonts w:asciiTheme="minorHAnsi" w:hAnsiTheme="minorHAnsi"/>
+          <w:color w:val="26352F"/>
+          <w:sz w:val="21"/>
+          <w:szCs w:val="21"/>
+        </w:rPr>
+        <w:t xml:space="preserve"> Limited, Merrion Road, Dublin 4, D04 X2K5, Irland („</w:t>
+      </w:r>
+      <w:proofErr w:type="spellStart"/>
+      <w:r>
+        <w:rPr>
+          <w:rFonts w:asciiTheme="minorHAnsi" w:hAnsiTheme="minorHAnsi"/>
+          <w:color w:val="26352F"/>
+          <w:sz w:val="21"/>
+          <w:szCs w:val="21"/>
+        </w:rPr>
+        <w:t>Meta</w:t>
+      </w:r>
+      <w:proofErr w:type="spellEnd"/>
+      <w:r>
+        <w:rPr>
+          <w:rFonts w:asciiTheme="minorHAnsi" w:hAnsiTheme="minorHAnsi"/>
+          <w:color w:val="26352F"/>
+          <w:sz w:val="21"/>
+          <w:szCs w:val="21"/>
+        </w:rPr>
+        <w:t xml:space="preserve">“). Wenn Sie unser Instagram-Profil besuchen oder mit diesem interagieren, können personenbezogene Daten durch </w:t>
+      </w:r>
+      <w:proofErr w:type="spellStart"/>
+      <w:r>
+        <w:rPr>
+          <w:rFonts w:asciiTheme="minorHAnsi" w:hAnsiTheme="minorHAnsi"/>
+          <w:color w:val="26352F"/>
+          <w:sz w:val="21"/>
+          <w:szCs w:val="21"/>
+        </w:rPr>
+        <w:t>Meta</w:t>
+      </w:r>
+      <w:proofErr w:type="spellEnd"/>
+      <w:r>
+        <w:rPr>
+          <w:rFonts w:asciiTheme="minorHAnsi" w:hAnsiTheme="minorHAnsi"/>
+          <w:color w:val="26352F"/>
+          <w:sz w:val="21"/>
+          <w:szCs w:val="21"/>
+        </w:rPr>
+        <w:t xml:space="preserve"> verarbeitet werden. Dies kann insbesondere Informationen über Ihr Nutzerkonto, Ihre IP-Adresse, Geräte- und Browserinformationen, Nutzungsdaten, Interaktionen mit Inhalten, Likes, Kommentare, Direktnachrichten, </w:t>
+      </w:r>
+      <w:proofErr w:type="spellStart"/>
+      <w:r>
+        <w:rPr>
+          <w:rFonts w:asciiTheme="minorHAnsi" w:hAnsiTheme="minorHAnsi"/>
+          <w:color w:val="26352F"/>
+          <w:sz w:val="21"/>
+          <w:szCs w:val="21"/>
+        </w:rPr>
+        <w:t>Follows</w:t>
+      </w:r>
+      <w:proofErr w:type="spellEnd"/>
+      <w:r>
+        <w:rPr>
+          <w:rFonts w:asciiTheme="minorHAnsi" w:hAnsiTheme="minorHAnsi"/>
+          <w:color w:val="26352F"/>
+          <w:sz w:val="21"/>
+          <w:szCs w:val="21"/>
+        </w:rPr>
+        <w:t xml:space="preserve"> sowie weitere Daten umfassen, die Sie Instagram bereitstellen oder die bei der Nutzung von Instagram entstehen.</w:t>
+      </w:r>
+    </w:p>
+    <w:p>
+      <w:pPr>
+        <w:pStyle w:val="berschrift3"/>
+        <w:spacing w:after="120"/>
+        <w:rPr>
+          <w:lang w:val="de-DE"/>
+        </w:rPr>
+      </w:pPr>
+      <w:r>
+        <w:rPr>
+          <w:lang w:val="de-DE"/>
+        </w:rPr>
+        <w:t>Nutzung von Instagram in eigener Verantwortung</w:t>
+      </w:r>
+    </w:p>
+    <w:p>
+      <w:pPr>
+        <w:pStyle w:val="StandardWeb"/>
+        <w:rPr>
+          <w:rFonts w:asciiTheme="minorHAnsi" w:hAnsiTheme="minorHAnsi"/>
+          <w:color w:val="26352F"/>
+          <w:sz w:val="21"/>
+          <w:szCs w:val="21"/>
+        </w:rPr>
+      </w:pPr>
+      <w:r>
+        <w:rPr>
+          <w:rFonts w:asciiTheme="minorHAnsi" w:hAnsiTheme="minorHAnsi"/>
+          <w:color w:val="26352F"/>
+          <w:sz w:val="21"/>
+          <w:szCs w:val="21"/>
+        </w:rPr>
+        <w:t xml:space="preserve">Wir weisen darauf hin, dass Sie Instagram und dessen Funktionen in eigener Verantwortung nutzen. Dies gilt insbesondere für interaktive Funktionen wie Kommentieren, Liken, Teilen, Folgen oder das Senden von Direktnachrichten. Auf Art und Umfang der Datenverarbeitung durch </w:t>
+      </w:r>
+      <w:proofErr w:type="spellStart"/>
+      <w:r>
+        <w:rPr>
+          <w:rFonts w:asciiTheme="minorHAnsi" w:hAnsiTheme="minorHAnsi"/>
+          <w:color w:val="26352F"/>
+          <w:sz w:val="21"/>
+          <w:szCs w:val="21"/>
+        </w:rPr>
+        <w:t>Meta</w:t>
+      </w:r>
+      <w:proofErr w:type="spellEnd"/>
+      <w:r>
+        <w:rPr>
+          <w:rFonts w:asciiTheme="minorHAnsi" w:hAnsiTheme="minorHAnsi"/>
+          <w:color w:val="26352F"/>
+          <w:sz w:val="21"/>
+          <w:szCs w:val="21"/>
+        </w:rPr>
+        <w:t xml:space="preserve"> haben wir nur begrenzten Einfluss. Weitere Informationen zur Verarbeitung personenbezogener Daten durch </w:t>
+      </w:r>
+      <w:proofErr w:type="spellStart"/>
+      <w:r>
+        <w:rPr>
+          <w:rFonts w:asciiTheme="minorHAnsi" w:hAnsiTheme="minorHAnsi"/>
+          <w:color w:val="26352F"/>
+          <w:sz w:val="21"/>
+          <w:szCs w:val="21"/>
+        </w:rPr>
+        <w:t>Meta</w:t>
+      </w:r>
+      <w:proofErr w:type="spellEnd"/>
+      <w:r>
+        <w:rPr>
+          <w:rFonts w:asciiTheme="minorHAnsi" w:hAnsiTheme="minorHAnsi"/>
+          <w:color w:val="26352F"/>
+          <w:sz w:val="21"/>
+          <w:szCs w:val="21"/>
+        </w:rPr>
+        <w:t xml:space="preserve"> finden Sie in den Datenschutzinformationen von Instagram bzw. </w:t>
+      </w:r>
+      <w:proofErr w:type="spellStart"/>
+      <w:r>
+        <w:rPr>
+          <w:rFonts w:asciiTheme="minorHAnsi" w:hAnsiTheme="minorHAnsi"/>
+          <w:color w:val="26352F"/>
+          <w:sz w:val="21"/>
+          <w:szCs w:val="21"/>
+        </w:rPr>
+        <w:t>Meta</w:t>
+      </w:r>
+      <w:proofErr w:type="spellEnd"/>
+      <w:r>
+        <w:rPr>
+          <w:rFonts w:asciiTheme="minorHAnsi" w:hAnsiTheme="minorHAnsi"/>
+          <w:color w:val="26352F"/>
+          <w:sz w:val="21"/>
+          <w:szCs w:val="21"/>
+        </w:rPr>
+        <w:t>.</w:t>
+      </w:r>
+    </w:p>
+    <w:p>
+      <w:pPr>
+        <w:pStyle w:val="berschrift3"/>
+        <w:spacing w:after="120"/>
+        <w:rPr>
+          <w:lang w:val="de-DE"/>
+        </w:rPr>
+      </w:pPr>
+      <w:r>
+        <w:rPr>
+          <w:lang w:val="de-DE"/>
+        </w:rPr>
+        <w:t>Interaktionen mit unserem Instagram-Profil</w:t>
+      </w:r>
+    </w:p>
+    <w:p>
+      <w:pPr>
+        <w:pStyle w:val="StandardWeb"/>
+        <w:rPr>
+          <w:rFonts w:asciiTheme="minorHAnsi" w:hAnsiTheme="minorHAnsi"/>
+          <w:color w:val="26352F"/>
+          <w:sz w:val="21"/>
+          <w:szCs w:val="21"/>
+        </w:rPr>
+      </w:pPr>
+      <w:r>
+        <w:rPr>
+          <w:rFonts w:asciiTheme="minorHAnsi" w:hAnsiTheme="minorHAnsi"/>
+          <w:color w:val="26352F"/>
+          <w:sz w:val="21"/>
+          <w:szCs w:val="21"/>
+        </w:rPr>
+        <w:t>Wenn Sie mit unserem Instagram-Profil interagieren, zum Beispiel indem Sie uns folgen, Beiträge kommentieren, Beiträge liken oder uns eine Direktnachricht senden, können wir die von Ihnen öffentlich oder direkt übermittelten Informationen sehen und verarbeiten. Dazu können insbesondere Ihr Instagram-Nutzername, Ihr Profilbild, öffentlich sichtbare Profilinformationen, Ihre Kommentare, Reaktionen sowie der Inhalt Ihrer Nachrichten gehören.</w:t>
+      </w:r>
+    </w:p>
+    <w:p>
+      <w:pPr>
+        <w:pStyle w:val="StandardWeb"/>
+        <w:rPr>
+          <w:rFonts w:asciiTheme="minorHAnsi" w:hAnsiTheme="minorHAnsi"/>
+          <w:color w:val="26352F"/>
+          <w:sz w:val="21"/>
+          <w:szCs w:val="21"/>
+        </w:rPr>
+      </w:pPr>
+      <w:r>
+        <w:rPr>
+          <w:rFonts w:asciiTheme="minorHAnsi" w:hAnsiTheme="minorHAnsi"/>
+          <w:color w:val="26352F"/>
+          <w:sz w:val="21"/>
+          <w:szCs w:val="21"/>
+        </w:rPr>
+        <w:t xml:space="preserve">Wir verarbeiten diese Daten, soweit dies in unserer Verantwortlichkeit liegt, ausschließlich zur Kommunikation mit Ihnen, zur Bearbeitung von Anfragen, zur Information über unser Angebot und zur Öffentlichkeitsarbeit für </w:t>
+      </w:r>
+      <w:proofErr w:type="spellStart"/>
+      <w:r>
+        <w:rPr>
+          <w:rFonts w:asciiTheme="minorHAnsi" w:hAnsiTheme="minorHAnsi"/>
+          <w:color w:val="26352F"/>
+          <w:sz w:val="21"/>
+          <w:szCs w:val="21"/>
+        </w:rPr>
+        <w:t>LoopLeaf</w:t>
+      </w:r>
+      <w:proofErr w:type="spellEnd"/>
+      <w:r>
+        <w:rPr>
+          <w:rFonts w:asciiTheme="minorHAnsi" w:hAnsiTheme="minorHAnsi"/>
+          <w:color w:val="26352F"/>
+          <w:sz w:val="21"/>
+          <w:szCs w:val="21"/>
+        </w:rPr>
+        <w:t xml:space="preserve">. Die Verarbeitung erfolgt auf Grundlage von Art. 6 Abs. 1 </w:t>
+      </w:r>
+      <w:proofErr w:type="spellStart"/>
+      <w:r>
+        <w:rPr>
+          <w:rFonts w:asciiTheme="minorHAnsi" w:hAnsiTheme="minorHAnsi"/>
+          <w:color w:val="26352F"/>
+          <w:sz w:val="21"/>
+          <w:szCs w:val="21"/>
+        </w:rPr>
+        <w:t>lit</w:t>
+      </w:r>
+      <w:proofErr w:type="spellEnd"/>
+      <w:r>
+        <w:rPr>
+          <w:rFonts w:asciiTheme="minorHAnsi" w:hAnsiTheme="minorHAnsi"/>
+          <w:color w:val="26352F"/>
+          <w:sz w:val="21"/>
+          <w:szCs w:val="21"/>
+        </w:rPr>
+        <w:t xml:space="preserve">. f DSGVO aufgrund unseres berechtigten Interesses an Öffentlichkeitsarbeit, Kommunikation und Information über unser Angebot. Soweit Ihre Anfrage auf den Abschluss eines Vertrags oder vorvertragliche Maßnahmen gerichtet ist, kann die Verarbeitung zusätzlich auf Grundlage von Art. 6 Abs. 1 </w:t>
+      </w:r>
+      <w:proofErr w:type="spellStart"/>
+      <w:r>
+        <w:rPr>
+          <w:rFonts w:asciiTheme="minorHAnsi" w:hAnsiTheme="minorHAnsi"/>
+          <w:color w:val="26352F"/>
+          <w:sz w:val="21"/>
+          <w:szCs w:val="21"/>
+        </w:rPr>
+        <w:t>lit</w:t>
+      </w:r>
+      <w:proofErr w:type="spellEnd"/>
+      <w:r>
+        <w:rPr>
+          <w:rFonts w:asciiTheme="minorHAnsi" w:hAnsiTheme="minorHAnsi"/>
+          <w:color w:val="26352F"/>
+          <w:sz w:val="21"/>
+          <w:szCs w:val="21"/>
+        </w:rPr>
+        <w:t>. b DSGVO erfolgen.</w:t>
+      </w:r>
+    </w:p>
+    <w:p>
+      <w:pPr>
+        <w:pStyle w:val="berschrift3"/>
+        <w:spacing w:after="120"/>
+        <w:rPr>
+          <w:lang w:val="de-DE"/>
+        </w:rPr>
+      </w:pPr>
+      <w:r>
+        <w:rPr>
+          <w:lang w:val="de-DE"/>
+        </w:rPr>
+        <w:t>Direktnachrichten über Instagram</w:t>
+      </w:r>
+    </w:p>
+    <w:p>
+      <w:pPr>
+        <w:pStyle w:val="StandardWeb"/>
+        <w:rPr>
+          <w:rFonts w:asciiTheme="minorHAnsi" w:hAnsiTheme="minorHAnsi"/>
+          <w:color w:val="26352F"/>
+          <w:sz w:val="21"/>
+          <w:szCs w:val="21"/>
+        </w:rPr>
+      </w:pPr>
+      <w:r>
+        <w:rPr>
+          <w:rFonts w:asciiTheme="minorHAnsi" w:hAnsiTheme="minorHAnsi"/>
+          <w:color w:val="26352F"/>
+          <w:sz w:val="21"/>
+          <w:szCs w:val="21"/>
+        </w:rPr>
+        <w:t>Wenn Sie uns über Instagram eine Direktnachricht senden, verarbeiten wir die darin enthaltenen Angaben zur Bearbeitung Ihrer Anfrage. Bitte übermitteln Sie über Instagram keine besonders sensiblen oder vertraulichen Informationen. Für vertrauliche Anliegen empfehlen wir die Kontaktaufnahme per E-Mail über die in unserem Impressum bzw. auf unserer Website angegebenen Kontaktmöglichkeiten.</w:t>
+      </w:r>
+    </w:p>
+    <w:p>
+      <w:pPr>
+        <w:pStyle w:val="berschrift3"/>
+        <w:spacing w:after="120"/>
+        <w:rPr>
+          <w:lang w:val="de-DE"/>
+        </w:rPr>
+      </w:pPr>
+      <w:r>
+        <w:rPr>
+          <w:lang w:val="de-DE"/>
+        </w:rPr>
+        <w:t xml:space="preserve">Instagram-Statistiken und </w:t>
+      </w:r>
+      <w:proofErr w:type="spellStart"/>
+      <w:r>
+        <w:rPr>
+          <w:lang w:val="de-DE"/>
+        </w:rPr>
+        <w:t>Insights</w:t>
+      </w:r>
+      <w:proofErr w:type="spellEnd"/>
+    </w:p>
+    <w:p>
+      <w:pPr>
+        <w:pStyle w:val="StandardWeb"/>
+        <w:rPr>
+          <w:rFonts w:asciiTheme="minorHAnsi" w:hAnsiTheme="minorHAnsi"/>
+          <w:color w:val="26352F"/>
+          <w:sz w:val="21"/>
+          <w:szCs w:val="21"/>
+        </w:rPr>
+      </w:pPr>
+      <w:r>
+        <w:rPr>
+          <w:rFonts w:asciiTheme="minorHAnsi" w:hAnsiTheme="minorHAnsi"/>
+          <w:color w:val="26352F"/>
+          <w:sz w:val="21"/>
+          <w:szCs w:val="21"/>
+        </w:rPr>
+        <w:t xml:space="preserve">Instagram kann uns statistische Informationen über die Nutzung unseres Profils und unserer Inhalte bereitstellen, zum Beispiel Reichweiten, Interaktionen, Aufrufe oder demografische Angaben in </w:t>
+      </w:r>
+      <w:r>
+        <w:rPr>
+          <w:rFonts w:asciiTheme="minorHAnsi" w:hAnsiTheme="minorHAnsi"/>
+          <w:color w:val="26352F"/>
+          <w:sz w:val="21"/>
+          <w:szCs w:val="21"/>
+        </w:rPr>
+        <w:lastRenderedPageBreak/>
+        <w:t>zusammengefasster Form. Diese Informationen können uns helfen, unser Informationsangebot besser zu verstehen und Inhalte nutzerfreundlicher zu gestalten. Soweit uns solche Statistiken bereitgestellt werden, erhalten wir diese grundsätzlich nur in aggregierter Form und können sie regelmäßig nicht einzelnen Personen zuordnen.</w:t>
+      </w:r>
+    </w:p>
+    <w:p>
+      <w:pPr>
+        <w:pStyle w:val="StandardWeb"/>
+        <w:rPr>
+          <w:rFonts w:asciiTheme="minorHAnsi" w:hAnsiTheme="minorHAnsi"/>
+          <w:color w:val="26352F"/>
+          <w:sz w:val="21"/>
+          <w:szCs w:val="21"/>
+        </w:rPr>
+      </w:pPr>
+      <w:r>
+        <w:rPr>
+          <w:rFonts w:asciiTheme="minorHAnsi" w:hAnsiTheme="minorHAnsi"/>
+          <w:color w:val="26352F"/>
+          <w:sz w:val="21"/>
+          <w:szCs w:val="21"/>
+        </w:rPr>
+        <w:t xml:space="preserve">Für die Verarbeitung sogenannter </w:t>
+      </w:r>
+      <w:proofErr w:type="spellStart"/>
+      <w:r>
+        <w:rPr>
+          <w:rFonts w:asciiTheme="minorHAnsi" w:hAnsiTheme="minorHAnsi"/>
+          <w:color w:val="26352F"/>
+          <w:sz w:val="21"/>
+          <w:szCs w:val="21"/>
+        </w:rPr>
+        <w:t>Insights</w:t>
+      </w:r>
+      <w:proofErr w:type="spellEnd"/>
+      <w:r>
+        <w:rPr>
+          <w:rFonts w:asciiTheme="minorHAnsi" w:hAnsiTheme="minorHAnsi"/>
+          <w:color w:val="26352F"/>
+          <w:sz w:val="21"/>
+          <w:szCs w:val="21"/>
+        </w:rPr>
+        <w:t xml:space="preserve">-Daten können </w:t>
+      </w:r>
+      <w:proofErr w:type="spellStart"/>
+      <w:r>
+        <w:rPr>
+          <w:rFonts w:asciiTheme="minorHAnsi" w:hAnsiTheme="minorHAnsi"/>
+          <w:color w:val="26352F"/>
+          <w:sz w:val="21"/>
+          <w:szCs w:val="21"/>
+        </w:rPr>
+        <w:t>Meta</w:t>
+      </w:r>
+      <w:proofErr w:type="spellEnd"/>
+      <w:r>
+        <w:rPr>
+          <w:rFonts w:asciiTheme="minorHAnsi" w:hAnsiTheme="minorHAnsi"/>
+          <w:color w:val="26352F"/>
+          <w:sz w:val="21"/>
+          <w:szCs w:val="21"/>
+        </w:rPr>
+        <w:t xml:space="preserve"> und wir gemeinsam verantwortlich im Sinne von Art. 26 DSGVO sein, soweit </w:t>
+      </w:r>
+      <w:proofErr w:type="spellStart"/>
+      <w:r>
+        <w:rPr>
+          <w:rFonts w:asciiTheme="minorHAnsi" w:hAnsiTheme="minorHAnsi"/>
+          <w:color w:val="26352F"/>
+          <w:sz w:val="21"/>
+          <w:szCs w:val="21"/>
+        </w:rPr>
+        <w:t>Meta</w:t>
+      </w:r>
+      <w:proofErr w:type="spellEnd"/>
+      <w:r>
+        <w:rPr>
+          <w:rFonts w:asciiTheme="minorHAnsi" w:hAnsiTheme="minorHAnsi"/>
+          <w:color w:val="26352F"/>
+          <w:sz w:val="21"/>
+          <w:szCs w:val="21"/>
+        </w:rPr>
+        <w:t xml:space="preserve"> uns entsprechende statistische Informationen über die Nutzung unseres Instagram-Profils bereitstellt. </w:t>
+      </w:r>
+      <w:proofErr w:type="spellStart"/>
+      <w:r>
+        <w:rPr>
+          <w:rFonts w:asciiTheme="minorHAnsi" w:hAnsiTheme="minorHAnsi"/>
+          <w:color w:val="26352F"/>
+          <w:sz w:val="21"/>
+          <w:szCs w:val="21"/>
+        </w:rPr>
+        <w:t>Meta</w:t>
+      </w:r>
+      <w:proofErr w:type="spellEnd"/>
+      <w:r>
+        <w:rPr>
+          <w:rFonts w:asciiTheme="minorHAnsi" w:hAnsiTheme="minorHAnsi"/>
+          <w:color w:val="26352F"/>
+          <w:sz w:val="21"/>
+          <w:szCs w:val="21"/>
+        </w:rPr>
+        <w:t xml:space="preserve"> übernimmt nach den von </w:t>
+      </w:r>
+      <w:proofErr w:type="spellStart"/>
+      <w:r>
+        <w:rPr>
+          <w:rFonts w:asciiTheme="minorHAnsi" w:hAnsiTheme="minorHAnsi"/>
+          <w:color w:val="26352F"/>
+          <w:sz w:val="21"/>
+          <w:szCs w:val="21"/>
+        </w:rPr>
+        <w:t>Meta</w:t>
+      </w:r>
+      <w:proofErr w:type="spellEnd"/>
+      <w:r>
+        <w:rPr>
+          <w:rFonts w:asciiTheme="minorHAnsi" w:hAnsiTheme="minorHAnsi"/>
+          <w:color w:val="26352F"/>
+          <w:sz w:val="21"/>
+          <w:szCs w:val="21"/>
+        </w:rPr>
+        <w:t xml:space="preserve"> bereitgestellten Regelungen wesentliche Pflichten im Zusammenhang mit der Verarbeitung dieser </w:t>
+      </w:r>
+      <w:proofErr w:type="spellStart"/>
+      <w:r>
+        <w:rPr>
+          <w:rFonts w:asciiTheme="minorHAnsi" w:hAnsiTheme="minorHAnsi"/>
+          <w:color w:val="26352F"/>
+          <w:sz w:val="21"/>
+          <w:szCs w:val="21"/>
+        </w:rPr>
+        <w:t>Insights</w:t>
+      </w:r>
+      <w:proofErr w:type="spellEnd"/>
+      <w:r>
+        <w:rPr>
+          <w:rFonts w:asciiTheme="minorHAnsi" w:hAnsiTheme="minorHAnsi"/>
+          <w:color w:val="26352F"/>
+          <w:sz w:val="21"/>
+          <w:szCs w:val="21"/>
+        </w:rPr>
+        <w:t xml:space="preserve">-Daten. Weitere Informationen hierzu finden Sie in den von </w:t>
+      </w:r>
+      <w:proofErr w:type="spellStart"/>
+      <w:r>
+        <w:rPr>
+          <w:rFonts w:asciiTheme="minorHAnsi" w:hAnsiTheme="minorHAnsi"/>
+          <w:color w:val="26352F"/>
+          <w:sz w:val="21"/>
+          <w:szCs w:val="21"/>
+        </w:rPr>
+        <w:t>Meta</w:t>
+      </w:r>
+      <w:proofErr w:type="spellEnd"/>
+      <w:r>
+        <w:rPr>
+          <w:rFonts w:asciiTheme="minorHAnsi" w:hAnsiTheme="minorHAnsi"/>
+          <w:color w:val="26352F"/>
+          <w:sz w:val="21"/>
+          <w:szCs w:val="21"/>
+        </w:rPr>
+        <w:t xml:space="preserve"> bereitgestellten Informationen zu Seiten-</w:t>
+      </w:r>
+      <w:proofErr w:type="spellStart"/>
+      <w:r>
+        <w:rPr>
+          <w:rFonts w:asciiTheme="minorHAnsi" w:hAnsiTheme="minorHAnsi"/>
+          <w:color w:val="26352F"/>
+          <w:sz w:val="21"/>
+          <w:szCs w:val="21"/>
+        </w:rPr>
+        <w:t>Insights</w:t>
+      </w:r>
+      <w:proofErr w:type="spellEnd"/>
+      <w:r>
+        <w:rPr>
+          <w:rFonts w:asciiTheme="minorHAnsi" w:hAnsiTheme="minorHAnsi"/>
+          <w:color w:val="26352F"/>
+          <w:sz w:val="21"/>
+          <w:szCs w:val="21"/>
+        </w:rPr>
+        <w:t xml:space="preserve"> bzw. den entsprechenden Regelungen zur gemeinsamen Verantwortlichkeit.</w:t>
+      </w:r>
+    </w:p>
+    <w:p>
+      <w:pPr>
+        <w:pStyle w:val="berschrift3"/>
+        <w:spacing w:after="120"/>
+        <w:rPr>
+          <w:lang w:val="de-DE"/>
+        </w:rPr>
+      </w:pPr>
+      <w:r>
+        <w:rPr>
+          <w:lang w:val="de-DE"/>
+        </w:rPr>
+        <w:t>Keine Instagram-Plugins auf unserer Website</w:t>
+      </w:r>
+    </w:p>
+    <w:p>
+      <w:pPr>
+        <w:pStyle w:val="StandardWeb"/>
+        <w:rPr>
+          <w:rFonts w:asciiTheme="minorHAnsi" w:hAnsiTheme="minorHAnsi"/>
+          <w:color w:val="26352F"/>
+          <w:sz w:val="21"/>
+          <w:szCs w:val="21"/>
+        </w:rPr>
+      </w:pPr>
+      <w:r>
+        <w:rPr>
+          <w:rFonts w:asciiTheme="minorHAnsi" w:hAnsiTheme="minorHAnsi"/>
+          <w:color w:val="26352F"/>
+          <w:sz w:val="21"/>
+          <w:szCs w:val="21"/>
+        </w:rPr>
+        <w:t xml:space="preserve">Wir selbst setzen auf unserer Website keine Instagram-Plugins, keine eingebetteten Instagram-Feeds, keine Instagram-Skripte, keine Like- oder Share-Buttons und keine Meta-Pixel ein. Eine Datenübertragung an Instagram bzw. </w:t>
+      </w:r>
+      <w:proofErr w:type="spellStart"/>
+      <w:r>
+        <w:rPr>
+          <w:rFonts w:asciiTheme="minorHAnsi" w:hAnsiTheme="minorHAnsi"/>
+          <w:color w:val="26352F"/>
+          <w:sz w:val="21"/>
+          <w:szCs w:val="21"/>
+        </w:rPr>
+        <w:t>Meta</w:t>
+      </w:r>
+      <w:proofErr w:type="spellEnd"/>
+      <w:r>
+        <w:rPr>
+          <w:rFonts w:asciiTheme="minorHAnsi" w:hAnsiTheme="minorHAnsi"/>
+          <w:color w:val="26352F"/>
+          <w:sz w:val="21"/>
+          <w:szCs w:val="21"/>
+        </w:rPr>
+        <w:t xml:space="preserve"> findet durch den bloßen Aufruf unserer Website aufgrund eines einfachen Instagram-Links nicht statt. Erst wenn Sie einen entsprechenden Link aktiv anklicken und Instagram öffnen, verlassen Sie unsere Website und es gelten die Datenschutzinformationen von Instagram bzw. </w:t>
+      </w:r>
+      <w:proofErr w:type="spellStart"/>
+      <w:r>
+        <w:rPr>
+          <w:rFonts w:asciiTheme="minorHAnsi" w:hAnsiTheme="minorHAnsi"/>
+          <w:color w:val="26352F"/>
+          <w:sz w:val="21"/>
+          <w:szCs w:val="21"/>
+        </w:rPr>
+        <w:t>Meta</w:t>
+      </w:r>
+      <w:proofErr w:type="spellEnd"/>
+      <w:r>
+        <w:rPr>
+          <w:rFonts w:asciiTheme="minorHAnsi" w:hAnsiTheme="minorHAnsi"/>
+          <w:color w:val="26352F"/>
+          <w:sz w:val="21"/>
+          <w:szCs w:val="21"/>
+        </w:rPr>
+        <w:t>.</w:t>
+      </w:r>
+    </w:p>
+    <w:p>
+      <w:pPr>
+        <w:pStyle w:val="berschrift3"/>
+        <w:spacing w:after="120"/>
+        <w:rPr>
+          <w:lang w:val="de-DE"/>
+        </w:rPr>
+      </w:pPr>
+      <w:r>
+        <w:rPr>
+          <w:lang w:val="de-DE"/>
+        </w:rPr>
+        <w:t>Speicherdauer und Löschung</w:t>
+      </w:r>
+    </w:p>
+    <w:p>
+      <w:pPr>
+        <w:pStyle w:val="StandardWeb"/>
+        <w:rPr>
+          <w:rFonts w:asciiTheme="minorHAnsi" w:hAnsiTheme="minorHAnsi"/>
+          <w:color w:val="26352F"/>
+          <w:sz w:val="21"/>
+          <w:szCs w:val="21"/>
+        </w:rPr>
+      </w:pPr>
+      <w:r>
+        <w:rPr>
+          <w:rFonts w:asciiTheme="minorHAnsi" w:hAnsiTheme="minorHAnsi"/>
+          <w:color w:val="26352F"/>
+          <w:sz w:val="21"/>
+          <w:szCs w:val="21"/>
+        </w:rPr>
+        <w:t>Wir löschen personenbezogene Daten, die wir im Rahmen der Kommunikation über Instagram verarbeiten, sobald sie für die genannten Zwecke nicht mehr erforderlich sind und keine gesetzlichen Aufbewahrungspflichten entgegenstehen. Öffentliche Kommentare und Interaktionen bleiben grundsätzlich sichtbar, solange sie von Ihnen nicht gelöscht werden oder wir sie im Rahmen der Plattformfunktionen entfernen.</w:t>
+      </w:r>
+    </w:p>
+    <w:p>
+      <w:pPr>
+        <w:pStyle w:val="berschrift3"/>
+        <w:spacing w:after="120"/>
+        <w:rPr>
+          <w:lang w:val="de-DE"/>
+        </w:rPr>
+      </w:pPr>
+      <w:r>
+        <w:rPr>
+          <w:lang w:val="de-DE"/>
+        </w:rPr>
+        <w:t>Betroffenenrechte und Privatsphäre-Einstellungen</w:t>
+      </w:r>
+    </w:p>
+    <w:p>
+      <w:pPr>
+        <w:pStyle w:val="StandardWeb"/>
+        <w:rPr>
+          <w:rFonts w:asciiTheme="minorHAnsi" w:hAnsiTheme="minorHAnsi"/>
+          <w:color w:val="26352F"/>
+          <w:sz w:val="21"/>
+          <w:szCs w:val="21"/>
+        </w:rPr>
+      </w:pPr>
+      <w:r>
+        <w:rPr>
+          <w:rFonts w:asciiTheme="minorHAnsi" w:hAnsiTheme="minorHAnsi"/>
+          <w:color w:val="26352F"/>
+          <w:sz w:val="21"/>
+          <w:szCs w:val="21"/>
+        </w:rPr>
+        <w:t xml:space="preserve">Sie haben im Rahmen der gesetzlichen Voraussetzungen insbesondere das Recht auf Auskunft, Berichtigung, Löschung, Einschränkung der Verarbeitung, Datenübertragbarkeit sowie Widerspruch gegen bestimmte Verarbeitungen. Soweit sich Ihre Rechte auf eine Verarbeitung durch </w:t>
+      </w:r>
+      <w:proofErr w:type="spellStart"/>
+      <w:r>
+        <w:rPr>
+          <w:rFonts w:asciiTheme="minorHAnsi" w:hAnsiTheme="minorHAnsi"/>
+          <w:color w:val="26352F"/>
+          <w:sz w:val="21"/>
+          <w:szCs w:val="21"/>
+        </w:rPr>
+        <w:t>Meta</w:t>
+      </w:r>
+      <w:proofErr w:type="spellEnd"/>
+      <w:r>
+        <w:rPr>
+          <w:rFonts w:asciiTheme="minorHAnsi" w:hAnsiTheme="minorHAnsi"/>
+          <w:color w:val="26352F"/>
+          <w:sz w:val="21"/>
+          <w:szCs w:val="21"/>
+        </w:rPr>
+        <w:t xml:space="preserve"> beziehen, können Sie diese Rechte auch direkt gegenüber </w:t>
+      </w:r>
+      <w:proofErr w:type="spellStart"/>
+      <w:r>
+        <w:rPr>
+          <w:rFonts w:asciiTheme="minorHAnsi" w:hAnsiTheme="minorHAnsi"/>
+          <w:color w:val="26352F"/>
+          <w:sz w:val="21"/>
+          <w:szCs w:val="21"/>
+        </w:rPr>
+        <w:t>Meta</w:t>
+      </w:r>
+      <w:proofErr w:type="spellEnd"/>
+      <w:r>
+        <w:rPr>
+          <w:rFonts w:asciiTheme="minorHAnsi" w:hAnsiTheme="minorHAnsi"/>
+          <w:color w:val="26352F"/>
+          <w:sz w:val="21"/>
+          <w:szCs w:val="21"/>
+        </w:rPr>
+        <w:t xml:space="preserve"> geltend machen. Da </w:t>
+      </w:r>
+      <w:proofErr w:type="spellStart"/>
+      <w:r>
+        <w:rPr>
+          <w:rFonts w:asciiTheme="minorHAnsi" w:hAnsiTheme="minorHAnsi"/>
+          <w:color w:val="26352F"/>
+          <w:sz w:val="21"/>
+          <w:szCs w:val="21"/>
+        </w:rPr>
+        <w:t>Meta</w:t>
+      </w:r>
+      <w:proofErr w:type="spellEnd"/>
+      <w:r>
+        <w:rPr>
+          <w:rFonts w:asciiTheme="minorHAnsi" w:hAnsiTheme="minorHAnsi"/>
+          <w:color w:val="26352F"/>
+          <w:sz w:val="21"/>
+          <w:szCs w:val="21"/>
+        </w:rPr>
+        <w:t xml:space="preserve"> wesentliche Teile der Datenverarbeitung auf Instagram selbst durchführt und wir darauf nur begrenzten Einfluss haben, kann </w:t>
+      </w:r>
+      <w:proofErr w:type="spellStart"/>
+      <w:r>
+        <w:rPr>
+          <w:rFonts w:asciiTheme="minorHAnsi" w:hAnsiTheme="minorHAnsi"/>
+          <w:color w:val="26352F"/>
+          <w:sz w:val="21"/>
+          <w:szCs w:val="21"/>
+        </w:rPr>
+        <w:t>Meta</w:t>
+      </w:r>
+      <w:proofErr w:type="spellEnd"/>
+      <w:r>
+        <w:rPr>
+          <w:rFonts w:asciiTheme="minorHAnsi" w:hAnsiTheme="minorHAnsi"/>
+          <w:color w:val="26352F"/>
+          <w:sz w:val="21"/>
+          <w:szCs w:val="21"/>
+        </w:rPr>
+        <w:t xml:space="preserve"> in vielen Fällen unmittelbarer auf entsprechende Anfragen reagieren.</w:t>
+      </w:r>
+    </w:p>
+    <w:p>
+      <w:pPr>
+        <w:pStyle w:val="StandardWeb"/>
+        <w:rPr>
+          <w:rFonts w:asciiTheme="minorHAnsi" w:hAnsiTheme="minorHAnsi"/>
+          <w:color w:val="26352F"/>
+          <w:sz w:val="21"/>
+          <w:szCs w:val="21"/>
+        </w:rPr>
+      </w:pPr>
+      <w:r>
+        <w:rPr>
+          <w:rFonts w:asciiTheme="minorHAnsi" w:hAnsiTheme="minorHAnsi"/>
+          <w:color w:val="26352F"/>
+          <w:sz w:val="21"/>
+          <w:szCs w:val="21"/>
+        </w:rPr>
+        <w:t>Sie können Ihre Privatsphäre-Einstellungen innerhalb Ihres Instagram-Kontos selbst anpassen. Außerdem können Sie Interaktionen mit unserem Profil, etwa Kommentare, Likes oder Direktnachrichten, im Rahmen der von Instagram bereitgestellten Funktionen verwalten oder löschen.</w:t>
+      </w:r>
+      <w:bookmarkEnd w:id="4"/>
     </w:p>
     <w:sectPr>
       <w:pgSz w:w="12240" w:h="15840"/>
@@ -17241,7 +18215,6 @@
     <w:name w:val="Normal (Web)"/>
     <w:basedOn w:val="Standard"/>
     <w:uiPriority w:val="99"/>
-    <w:semiHidden/>
     <w:unhideWhenUsed/>
     <w:rsid w:val="0095255D"/>
     <w:pPr>

</xml_diff>